<commit_message>
docs: Fix numbering and reorganize grading guide structure
- Correct requirement numbering in Risk Register section (4.1-4.5 → 3.1-3.5)
- Correct requirement numbering in RACI Matrix section (6.1-6.5 → 4.1-4.5)
- Update all corresponding rubric criteria numbering to match requirement changes
- Move README.md from grader_tool/ to project root for better visibility
- Ensure consistent numbering across all grading criteria and rubric tables
</commit_message>
<xml_diff>
--- a/PMG201c_SP26_2ndFE_PE_Grading_Guides.docx
+++ b/PMG201c_SP26_2ndFE_PE_Grading_Guides.docx
@@ -3968,7 +3968,15 @@
                 <w:sz w:val="20"/>
                 <w:szCs w:val="20"/>
               </w:rPr>
-              <w:t>4.1 Số lượng rủi ro (tối thiểu 3)</w:t>
+              <w:t>3</w:t>
+            </w:r>
+            <w:r>
+              <w:rPr>
+                <w:color w:val="1A1A1A"/>
+                <w:sz w:val="20"/>
+                <w:szCs w:val="20"/>
+              </w:rPr>
+              <w:t>.1 Số lượng rủi ro (tối thiểu 3)</w:t>
             </w:r>
           </w:p>
         </w:tc>
@@ -4031,7 +4039,15 @@
                 <w:sz w:val="20"/>
                 <w:szCs w:val="20"/>
               </w:rPr>
-              <w:t>4.2 Mô tả rủi ro rõ ràng (điều kiện + hậu quả)</w:t>
+              <w:t>3</w:t>
+            </w:r>
+            <w:r>
+              <w:rPr>
+                <w:color w:val="1A1A1A"/>
+                <w:sz w:val="20"/>
+                <w:szCs w:val="20"/>
+              </w:rPr>
+              <w:t>.2 Mô tả rủi ro rõ ràng (điều kiện + hậu quả)</w:t>
             </w:r>
           </w:p>
         </w:tc>
@@ -4094,7 +4110,15 @@
                 <w:sz w:val="20"/>
                 <w:szCs w:val="20"/>
               </w:rPr>
-              <w:t>4.3 Tác động đến phạm vi/chất lượng, thời gian, chi phí</w:t>
+              <w:t>3</w:t>
+            </w:r>
+            <w:r>
+              <w:rPr>
+                <w:color w:val="1A1A1A"/>
+                <w:sz w:val="20"/>
+                <w:szCs w:val="20"/>
+              </w:rPr>
+              <w:t>.3 Tác động đến phạm vi/chất lượng, thời gian, chi phí</w:t>
             </w:r>
           </w:p>
         </w:tc>
@@ -4157,7 +4181,15 @@
                 <w:sz w:val="20"/>
                 <w:szCs w:val="20"/>
               </w:rPr>
-              <w:t>4.4 Kế hoạch giảm nhẹ rủi ro (Mitigation)</w:t>
+              <w:t>3</w:t>
+            </w:r>
+            <w:r>
+              <w:rPr>
+                <w:color w:val="1A1A1A"/>
+                <w:sz w:val="20"/>
+                <w:szCs w:val="20"/>
+              </w:rPr>
+              <w:t>.4 Kế hoạch giảm nhẹ rủi ro (Mitigation)</w:t>
             </w:r>
           </w:p>
         </w:tc>
@@ -4220,7 +4252,15 @@
                 <w:sz w:val="20"/>
                 <w:szCs w:val="20"/>
               </w:rPr>
-              <w:t>4.5 Kế hoạch dự phòng (Contingency)</w:t>
+              <w:t>3</w:t>
+            </w:r>
+            <w:r>
+              <w:rPr>
+                <w:color w:val="1A1A1A"/>
+                <w:sz w:val="20"/>
+                <w:szCs w:val="20"/>
+              </w:rPr>
+              <w:t>.5 Kế hoạch dự phòng (Contingency)</w:t>
             </w:r>
           </w:p>
         </w:tc>
@@ -4564,7 +4604,17 @@
                 <w:sz w:val="20"/>
                 <w:szCs w:val="20"/>
               </w:rPr>
-              <w:t>4.1 Số lượng rủi ro</w:t>
+              <w:t>3</w:t>
+            </w:r>
+            <w:r>
+              <w:rPr>
+                <w:b/>
+                <w:bCs/>
+                <w:color w:val="1A1A1A"/>
+                <w:sz w:val="20"/>
+                <w:szCs w:val="20"/>
+              </w:rPr>
+              <w:t>.1 Số lượng rủi ro</w:t>
             </w:r>
           </w:p>
         </w:tc>
@@ -4714,7 +4764,17 @@
                 <w:sz w:val="20"/>
                 <w:szCs w:val="20"/>
               </w:rPr>
-              <w:t>4.2 Mô tả rủi ro</w:t>
+              <w:t>3</w:t>
+            </w:r>
+            <w:r>
+              <w:rPr>
+                <w:b/>
+                <w:bCs/>
+                <w:color w:val="1A1A1A"/>
+                <w:sz w:val="20"/>
+                <w:szCs w:val="20"/>
+              </w:rPr>
+              <w:t>.2 Mô tả rủi ro</w:t>
             </w:r>
           </w:p>
         </w:tc>
@@ -4865,7 +4925,17 @@
                 <w:szCs w:val="20"/>
               </w:rPr>
               <w:lastRenderedPageBreak/>
-              <w:t>4.3 Tác động 3 chiều</w:t>
+              <w:t>3</w:t>
+            </w:r>
+            <w:r>
+              <w:rPr>
+                <w:b/>
+                <w:bCs/>
+                <w:color w:val="1A1A1A"/>
+                <w:sz w:val="20"/>
+                <w:szCs w:val="20"/>
+              </w:rPr>
+              <w:t>.3 Tác động 3 chiều</w:t>
             </w:r>
           </w:p>
         </w:tc>
@@ -5015,7 +5085,17 @@
                 <w:sz w:val="20"/>
                 <w:szCs w:val="20"/>
               </w:rPr>
-              <w:t>4.4 Mitigation plan</w:t>
+              <w:t>3</w:t>
+            </w:r>
+            <w:r>
+              <w:rPr>
+                <w:b/>
+                <w:bCs/>
+                <w:color w:val="1A1A1A"/>
+                <w:sz w:val="20"/>
+                <w:szCs w:val="20"/>
+              </w:rPr>
+              <w:t>.4 Mitigation plan</w:t>
             </w:r>
           </w:p>
         </w:tc>
@@ -5165,7 +5245,17 @@
                 <w:sz w:val="20"/>
                 <w:szCs w:val="20"/>
               </w:rPr>
-              <w:t>4.5 Contingency plan</w:t>
+              <w:t>3</w:t>
+            </w:r>
+            <w:r>
+              <w:rPr>
+                <w:b/>
+                <w:bCs/>
+                <w:color w:val="1A1A1A"/>
+                <w:sz w:val="20"/>
+                <w:szCs w:val="20"/>
+              </w:rPr>
+              <w:t>.5 Contingency plan</w:t>
             </w:r>
           </w:p>
         </w:tc>
@@ -5487,7 +5577,15 @@
                 <w:sz w:val="20"/>
                 <w:szCs w:val="20"/>
               </w:rPr>
-              <w:t>6.1 Số lượng vai trò (tối thiểu 3)</w:t>
+              <w:t>4</w:t>
+            </w:r>
+            <w:r>
+              <w:rPr>
+                <w:color w:val="1A1A1A"/>
+                <w:sz w:val="20"/>
+                <w:szCs w:val="20"/>
+              </w:rPr>
+              <w:t>.1 Số lượng vai trò (tối thiểu 3)</w:t>
             </w:r>
           </w:p>
         </w:tc>
@@ -5550,7 +5648,15 @@
                 <w:sz w:val="20"/>
                 <w:szCs w:val="20"/>
               </w:rPr>
-              <w:t>6.2 Số lượng nhiệm vụ/giao phẩm (tối thiểu 10)</w:t>
+              <w:t>4</w:t>
+            </w:r>
+            <w:r>
+              <w:rPr>
+                <w:color w:val="1A1A1A"/>
+                <w:sz w:val="20"/>
+                <w:szCs w:val="20"/>
+              </w:rPr>
+              <w:t>.2 Số lượng nhiệm vụ/giao phẩm (tối thiểu 10)</w:t>
             </w:r>
           </w:p>
         </w:tc>
@@ -5613,7 +5719,15 @@
                 <w:sz w:val="20"/>
                 <w:szCs w:val="20"/>
               </w:rPr>
-              <w:t>6.3 Mỗi nhiệm vụ có đúng 1 Responsible và 1 Accountable</w:t>
+              <w:t>4</w:t>
+            </w:r>
+            <w:r>
+              <w:rPr>
+                <w:color w:val="1A1A1A"/>
+                <w:sz w:val="20"/>
+                <w:szCs w:val="20"/>
+              </w:rPr>
+              <w:t>.3 Mỗi nhiệm vụ có đúng 1 Responsible và 1 Accountable</w:t>
             </w:r>
           </w:p>
         </w:tc>
@@ -5676,7 +5790,15 @@
                 <w:sz w:val="20"/>
                 <w:szCs w:val="20"/>
               </w:rPr>
-              <w:t>6.4 Phân công C và I hợp lý</w:t>
+              <w:t>4</w:t>
+            </w:r>
+            <w:r>
+              <w:rPr>
+                <w:color w:val="1A1A1A"/>
+                <w:sz w:val="20"/>
+                <w:szCs w:val="20"/>
+              </w:rPr>
+              <w:t>.4 Phân công C và I hợp lý</w:t>
             </w:r>
           </w:p>
         </w:tc>
@@ -5739,7 +5861,15 @@
                 <w:sz w:val="20"/>
                 <w:szCs w:val="20"/>
               </w:rPr>
-              <w:t>6.5 Vai trò và nhiệm vụ phù hợp ngữ cảnh dự án</w:t>
+              <w:t>4</w:t>
+            </w:r>
+            <w:r>
+              <w:rPr>
+                <w:color w:val="1A1A1A"/>
+                <w:sz w:val="20"/>
+                <w:szCs w:val="20"/>
+              </w:rPr>
+              <w:t>.5 Vai trò và nhiệm vụ phù hợp ngữ cảnh dự án</w:t>
             </w:r>
           </w:p>
         </w:tc>
@@ -6083,7 +6213,17 @@
                 <w:sz w:val="20"/>
                 <w:szCs w:val="20"/>
               </w:rPr>
-              <w:t>6.1 Số lượng vai trò</w:t>
+              <w:t>4</w:t>
+            </w:r>
+            <w:r>
+              <w:rPr>
+                <w:b/>
+                <w:bCs/>
+                <w:color w:val="1A1A1A"/>
+                <w:sz w:val="20"/>
+                <w:szCs w:val="20"/>
+              </w:rPr>
+              <w:t>.1 Số lượng vai trò</w:t>
             </w:r>
           </w:p>
         </w:tc>
@@ -6233,7 +6373,17 @@
                 <w:sz w:val="20"/>
                 <w:szCs w:val="20"/>
               </w:rPr>
-              <w:t>6.2 Số lượng nhiệm vụ</w:t>
+              <w:t>4</w:t>
+            </w:r>
+            <w:r>
+              <w:rPr>
+                <w:b/>
+                <w:bCs/>
+                <w:color w:val="1A1A1A"/>
+                <w:sz w:val="20"/>
+                <w:szCs w:val="20"/>
+              </w:rPr>
+              <w:t>.2 Số lượng nhiệm vụ</w:t>
             </w:r>
           </w:p>
         </w:tc>
@@ -6384,7 +6534,17 @@
                 <w:szCs w:val="20"/>
               </w:rPr>
               <w:lastRenderedPageBreak/>
-              <w:t>6.3 R và A</w:t>
+              <w:t>4</w:t>
+            </w:r>
+            <w:r>
+              <w:rPr>
+                <w:b/>
+                <w:bCs/>
+                <w:color w:val="1A1A1A"/>
+                <w:sz w:val="20"/>
+                <w:szCs w:val="20"/>
+              </w:rPr>
+              <w:t>.3 R và A</w:t>
             </w:r>
           </w:p>
         </w:tc>
@@ -6534,7 +6694,17 @@
                 <w:sz w:val="20"/>
                 <w:szCs w:val="20"/>
               </w:rPr>
-              <w:t>6.4 C và I hợp lý</w:t>
+              <w:t>4</w:t>
+            </w:r>
+            <w:r>
+              <w:rPr>
+                <w:b/>
+                <w:bCs/>
+                <w:color w:val="1A1A1A"/>
+                <w:sz w:val="20"/>
+                <w:szCs w:val="20"/>
+              </w:rPr>
+              <w:t>.4 C và I hợp lý</w:t>
             </w:r>
           </w:p>
         </w:tc>
@@ -6684,7 +6854,17 @@
                 <w:sz w:val="20"/>
                 <w:szCs w:val="20"/>
               </w:rPr>
-              <w:t>6.5 Phù hợp ngữ cảnh</w:t>
+              <w:t>4</w:t>
+            </w:r>
+            <w:r>
+              <w:rPr>
+                <w:b/>
+                <w:bCs/>
+                <w:color w:val="1A1A1A"/>
+                <w:sz w:val="20"/>
+                <w:szCs w:val="20"/>
+              </w:rPr>
+              <w:t>.5 Phù hợp ngữ cảnh</w:t>
             </w:r>
           </w:p>
         </w:tc>

</xml_diff>